<commit_message>
Finial set of fixes for the 0.10.2 drop
git-svn-id: http://parts.tigris.org/svn/parts/trunk/parts@453 5d30f1b0-9df1-49ce-985b-09f766a17f98
</commit_message>
<xml_diff>
--- a/doc/UserGuide.docx
+++ b/doc/UserGuide.docx
@@ -7428,7 +7428,7 @@
         <w:rFonts w:ascii="Symbol" w:hAnsi="Symbol" w:hint="default"/>
       </w:rPr>
     </w:lvl>
-    <w:lvl w:ilvl="1" w:tplc="04090003" w:tentative="1">
+    <w:lvl w:ilvl="1" w:tplc="04090003">
       <w:start w:val="1"/>
       <w:numFmt w:val="bullet"/>
       <w:lvlText w:val="o"/>
@@ -13831,6 +13831,102 @@
       <w:spacing w:val="0"/>
     </w:rPr>
   </w:style>
+  <w:style w:type="paragraph" w:customStyle="1" w:styleId="CodeBlock15">
+    <w:name w:val="Code Block15"/>
+    <w:basedOn w:val="Normal"/>
+    <w:uiPriority w:val="99"/>
+    <w:qFormat/>
+    <w:rsid w:val="008908EB"/>
+    <w:pPr>
+      <w:keepNext/>
+      <w:keepLines/>
+      <w:widowControl w:val="0"/>
+      <w:pBdr>
+        <w:top w:val="single" w:sz="8" w:space="1" w:color="4F81BD" w:themeColor="accent1"/>
+        <w:left w:val="single" w:sz="24" w:space="4" w:color="4F81BD" w:themeColor="accent1"/>
+      </w:pBdr>
+      <w:shd w:val="clear" w:color="auto" w:fill="EEECE1" w:themeFill="background2"/>
+      <w:spacing w:before="0" w:after="0"/>
+      <w:ind w:left="288" w:right="288"/>
+    </w:pPr>
+    <w:rPr>
+      <w:rFonts w:ascii="Courier New" w:hAnsi="Courier New"/>
+      <w:i/>
+      <w:szCs w:val="22"/>
+    </w:rPr>
+  </w:style>
+  <w:style w:type="paragraph" w:customStyle="1" w:styleId="FunctionDeclarationHeader13">
+    <w:name w:val="Function Declaration Header13"/>
+    <w:basedOn w:val="Heading4"/>
+    <w:qFormat/>
+    <w:rsid w:val="008908EB"/>
+    <w:pPr>
+      <w:keepNext/>
+      <w:keepLines/>
+      <w:pBdr>
+        <w:top w:val="none" w:sz="0" w:space="0" w:color="auto"/>
+        <w:left w:val="none" w:sz="0" w:space="0" w:color="auto"/>
+      </w:pBdr>
+      <w:shd w:val="clear" w:color="DBE5F1" w:themeColor="accent1" w:themeTint="33" w:fill="auto"/>
+      <w:spacing w:before="200"/>
+    </w:pPr>
+    <w:rPr>
+      <w:rFonts w:asciiTheme="majorHAnsi" w:eastAsiaTheme="majorEastAsia" w:hAnsiTheme="majorHAnsi" w:cstheme="majorBidi"/>
+      <w:b/>
+      <w:bCs/>
+      <w:iCs/>
+      <w:color w:val="4F81BD" w:themeColor="accent1"/>
+      <w:spacing w:val="0"/>
+    </w:rPr>
+  </w:style>
+  <w:style w:type="paragraph" w:customStyle="1" w:styleId="CodeBlock16">
+    <w:name w:val="Code Block16"/>
+    <w:basedOn w:val="Normal"/>
+    <w:uiPriority w:val="99"/>
+    <w:qFormat/>
+    <w:rsid w:val="008908EB"/>
+    <w:pPr>
+      <w:keepNext/>
+      <w:keepLines/>
+      <w:widowControl w:val="0"/>
+      <w:pBdr>
+        <w:top w:val="single" w:sz="8" w:space="1" w:color="4F81BD" w:themeColor="accent1"/>
+        <w:left w:val="single" w:sz="24" w:space="4" w:color="4F81BD" w:themeColor="accent1"/>
+      </w:pBdr>
+      <w:shd w:val="clear" w:color="auto" w:fill="EEECE1" w:themeFill="background2"/>
+      <w:spacing w:before="0" w:after="0"/>
+      <w:ind w:left="288" w:right="288"/>
+    </w:pPr>
+    <w:rPr>
+      <w:rFonts w:ascii="Courier New" w:hAnsi="Courier New"/>
+      <w:i/>
+      <w:szCs w:val="22"/>
+    </w:rPr>
+  </w:style>
+  <w:style w:type="paragraph" w:customStyle="1" w:styleId="FunctionDeclarationHeader14">
+    <w:name w:val="Function Declaration Header14"/>
+    <w:basedOn w:val="Heading4"/>
+    <w:qFormat/>
+    <w:rsid w:val="008908EB"/>
+    <w:pPr>
+      <w:keepNext/>
+      <w:keepLines/>
+      <w:pBdr>
+        <w:top w:val="none" w:sz="0" w:space="0" w:color="auto"/>
+        <w:left w:val="none" w:sz="0" w:space="0" w:color="auto"/>
+      </w:pBdr>
+      <w:shd w:val="clear" w:color="DBE5F1" w:themeColor="accent1" w:themeTint="33" w:fill="auto"/>
+      <w:spacing w:before="200"/>
+    </w:pPr>
+    <w:rPr>
+      <w:rFonts w:asciiTheme="majorHAnsi" w:eastAsiaTheme="majorEastAsia" w:hAnsiTheme="majorHAnsi" w:cstheme="majorBidi"/>
+      <w:b/>
+      <w:bCs/>
+      <w:iCs/>
+      <w:color w:val="4F81BD" w:themeColor="accent1"/>
+      <w:spacing w:val="0"/>
+    </w:rPr>
+  </w:style>
 </w:styles>
 </file>
 
@@ -15709,6 +15805,102 @@
       <w:bCs/>
       <w:iCs/>
       <w:caps/>
+      <w:color w:val="4F81BD" w:themeColor="accent1"/>
+      <w:spacing w:val="0"/>
+    </w:rPr>
+  </w:style>
+  <w:style w:type="paragraph" w:customStyle="1" w:styleId="CodeBlock15">
+    <w:name w:val="Code Block15"/>
+    <w:basedOn w:val="Normal"/>
+    <w:uiPriority w:val="99"/>
+    <w:qFormat/>
+    <w:rsid w:val="008908EB"/>
+    <w:pPr>
+      <w:keepNext/>
+      <w:keepLines/>
+      <w:widowControl w:val="0"/>
+      <w:pBdr>
+        <w:top w:val="single" w:sz="8" w:space="1" w:color="4F81BD" w:themeColor="accent1"/>
+        <w:left w:val="single" w:sz="24" w:space="4" w:color="4F81BD" w:themeColor="accent1"/>
+      </w:pBdr>
+      <w:shd w:val="clear" w:color="auto" w:fill="EEECE1" w:themeFill="background2"/>
+      <w:spacing w:before="0" w:after="0"/>
+      <w:ind w:left="288" w:right="288"/>
+    </w:pPr>
+    <w:rPr>
+      <w:rFonts w:ascii="Courier New" w:hAnsi="Courier New"/>
+      <w:i/>
+      <w:szCs w:val="22"/>
+    </w:rPr>
+  </w:style>
+  <w:style w:type="paragraph" w:customStyle="1" w:styleId="FunctionDeclarationHeader13">
+    <w:name w:val="Function Declaration Header13"/>
+    <w:basedOn w:val="Heading4"/>
+    <w:qFormat/>
+    <w:rsid w:val="008908EB"/>
+    <w:pPr>
+      <w:keepNext/>
+      <w:keepLines/>
+      <w:pBdr>
+        <w:top w:val="none" w:sz="0" w:space="0" w:color="auto"/>
+        <w:left w:val="none" w:sz="0" w:space="0" w:color="auto"/>
+      </w:pBdr>
+      <w:shd w:val="clear" w:color="DBE5F1" w:themeColor="accent1" w:themeTint="33" w:fill="auto"/>
+      <w:spacing w:before="200"/>
+    </w:pPr>
+    <w:rPr>
+      <w:rFonts w:asciiTheme="majorHAnsi" w:eastAsiaTheme="majorEastAsia" w:hAnsiTheme="majorHAnsi" w:cstheme="majorBidi"/>
+      <w:b/>
+      <w:bCs/>
+      <w:iCs/>
+      <w:color w:val="4F81BD" w:themeColor="accent1"/>
+      <w:spacing w:val="0"/>
+    </w:rPr>
+  </w:style>
+  <w:style w:type="paragraph" w:customStyle="1" w:styleId="CodeBlock16">
+    <w:name w:val="Code Block16"/>
+    <w:basedOn w:val="Normal"/>
+    <w:uiPriority w:val="99"/>
+    <w:qFormat/>
+    <w:rsid w:val="008908EB"/>
+    <w:pPr>
+      <w:keepNext/>
+      <w:keepLines/>
+      <w:widowControl w:val="0"/>
+      <w:pBdr>
+        <w:top w:val="single" w:sz="8" w:space="1" w:color="4F81BD" w:themeColor="accent1"/>
+        <w:left w:val="single" w:sz="24" w:space="4" w:color="4F81BD" w:themeColor="accent1"/>
+      </w:pBdr>
+      <w:shd w:val="clear" w:color="auto" w:fill="EEECE1" w:themeFill="background2"/>
+      <w:spacing w:before="0" w:after="0"/>
+      <w:ind w:left="288" w:right="288"/>
+    </w:pPr>
+    <w:rPr>
+      <w:rFonts w:ascii="Courier New" w:hAnsi="Courier New"/>
+      <w:i/>
+      <w:szCs w:val="22"/>
+    </w:rPr>
+  </w:style>
+  <w:style w:type="paragraph" w:customStyle="1" w:styleId="FunctionDeclarationHeader14">
+    <w:name w:val="Function Declaration Header14"/>
+    <w:basedOn w:val="Heading4"/>
+    <w:qFormat/>
+    <w:rsid w:val="008908EB"/>
+    <w:pPr>
+      <w:keepNext/>
+      <w:keepLines/>
+      <w:pBdr>
+        <w:top w:val="none" w:sz="0" w:space="0" w:color="auto"/>
+        <w:left w:val="none" w:sz="0" w:space="0" w:color="auto"/>
+      </w:pBdr>
+      <w:shd w:val="clear" w:color="DBE5F1" w:themeColor="accent1" w:themeTint="33" w:fill="auto"/>
+      <w:spacing w:before="200"/>
+    </w:pPr>
+    <w:rPr>
+      <w:rFonts w:asciiTheme="majorHAnsi" w:eastAsiaTheme="majorEastAsia" w:hAnsiTheme="majorHAnsi" w:cstheme="majorBidi"/>
+      <w:b/>
+      <w:bCs/>
+      <w:iCs/>
       <w:color w:val="4F81BD" w:themeColor="accent1"/>
       <w:spacing w:val="0"/>
     </w:rPr>
@@ -16006,7 +16198,7 @@
 </file>
 
 <file path=customXml/itemProps1.xml><?xml version="1.0" encoding="utf-8"?>
-<ds:datastoreItem xmlns:ds="http://schemas.openxmlformats.org/officeDocument/2006/customXml" ds:itemID="{BD69E8F9-8C2A-48D4-B8AA-0C61A7437592}">
+<ds:datastoreItem xmlns:ds="http://schemas.openxmlformats.org/officeDocument/2006/customXml" ds:itemID="{CF2170D8-33A4-4D01-98CD-6D5150522EF4}">
   <ds:schemaRefs>
     <ds:schemaRef ds:uri="http://schemas.openxmlformats.org/officeDocument/2006/bibliography"/>
   </ds:schemaRefs>

</xml_diff>

<commit_message>
documentation updates update to rpm.py new tests for RPM
git-svn-id: http://parts.tigris.org/svn/parts/trunk/parts@520 5d30f1b0-9df1-49ce-985b-09f766a17f98
</commit_message>
<xml_diff>
--- a/doc/UserGuide.docx
+++ b/doc/UserGuide.docx
@@ -6,7 +6,7 @@
       <w:pPr>
         <w:pStyle w:val="Heading1"/>
       </w:pPr>
-      <w:bookmarkStart w:id="0" w:name="_Toc353986012"/>
+      <w:bookmarkStart w:id="0" w:name="_Toc396470005"/>
       <w:r>
         <w:t>Parts User Guide</w:t>
       </w:r>
@@ -66,7 +66,7 @@
           <w:r>
             <w:fldChar w:fldCharType="separate"/>
           </w:r>
-          <w:hyperlink w:anchor="_Toc353986012" w:history="1">
+          <w:hyperlink w:anchor="_Toc396470005" w:history="1">
             <w:r>
               <w:rPr>
                 <w:rStyle w:val="Hyperlink"/>
@@ -93,7 +93,7 @@
                 <w:noProof/>
                 <w:webHidden/>
               </w:rPr>
-              <w:instrText xml:space="preserve"> PAGEREF _Toc353986012 \h </w:instrText>
+              <w:instrText xml:space="preserve"> PAGEREF _Toc396470005 \h </w:instrText>
             </w:r>
             <w:r>
               <w:rPr>
@@ -136,7 +136,7 @@
               <w:szCs w:val="22"/>
             </w:rPr>
           </w:pPr>
-          <w:hyperlink w:anchor="_Toc353986013" w:history="1">
+          <w:hyperlink w:anchor="_Toc396470006" w:history="1">
             <w:r>
               <w:rPr>
                 <w:rStyle w:val="Hyperlink"/>
@@ -163,7 +163,7 @@
                 <w:noProof/>
                 <w:webHidden/>
               </w:rPr>
-              <w:instrText xml:space="preserve"> PAGEREF _Toc353986013 \h </w:instrText>
+              <w:instrText xml:space="preserve"> PAGEREF _Toc396470006 \h </w:instrText>
             </w:r>
             <w:r>
               <w:rPr>
@@ -206,7 +206,7 @@
               <w:szCs w:val="22"/>
             </w:rPr>
           </w:pPr>
-          <w:hyperlink w:anchor="_Toc353986014" w:history="1">
+          <w:hyperlink w:anchor="_Toc396470007" w:history="1">
             <w:r>
               <w:rPr>
                 <w:rStyle w:val="Hyperlink"/>
@@ -233,7 +233,7 @@
                 <w:noProof/>
                 <w:webHidden/>
               </w:rPr>
-              <w:instrText xml:space="preserve"> PAGEREF _Toc353986014 \h </w:instrText>
+              <w:instrText xml:space="preserve"> PAGEREF _Toc396470007 \h </w:instrText>
             </w:r>
             <w:r>
               <w:rPr>
@@ -276,7 +276,7 @@
               <w:szCs w:val="22"/>
             </w:rPr>
           </w:pPr>
-          <w:hyperlink w:anchor="_Toc353986015" w:history="1">
+          <w:hyperlink w:anchor="_Toc396470008" w:history="1">
             <w:r>
               <w:rPr>
                 <w:rStyle w:val="Hyperlink"/>
@@ -303,7 +303,7 @@
                 <w:noProof/>
                 <w:webHidden/>
               </w:rPr>
-              <w:instrText xml:space="preserve"> PAGEREF _Toc353986015 \h </w:instrText>
+              <w:instrText xml:space="preserve"> PAGEREF _Toc396470008 \h </w:instrText>
             </w:r>
             <w:r>
               <w:rPr>
@@ -346,7 +346,7 @@
               <w:szCs w:val="22"/>
             </w:rPr>
           </w:pPr>
-          <w:hyperlink w:anchor="_Toc353986016" w:history="1">
+          <w:hyperlink w:anchor="_Toc396470009" w:history="1">
             <w:r>
               <w:rPr>
                 <w:rStyle w:val="Hyperlink"/>
@@ -373,7 +373,7 @@
                 <w:noProof/>
                 <w:webHidden/>
               </w:rPr>
-              <w:instrText xml:space="preserve"> PAGEREF _Toc353986016 \h </w:instrText>
+              <w:instrText xml:space="preserve"> PAGEREF _Toc396470009 \h </w:instrText>
             </w:r>
             <w:r>
               <w:rPr>
@@ -416,7 +416,7 @@
               <w:szCs w:val="22"/>
             </w:rPr>
           </w:pPr>
-          <w:hyperlink w:anchor="_Toc353986017" w:history="1">
+          <w:hyperlink w:anchor="_Toc396470010" w:history="1">
             <w:r>
               <w:rPr>
                 <w:rStyle w:val="Hyperlink"/>
@@ -443,7 +443,7 @@
                 <w:noProof/>
                 <w:webHidden/>
               </w:rPr>
-              <w:instrText xml:space="preserve"> PAGEREF _Toc353986017 \h </w:instrText>
+              <w:instrText xml:space="preserve"> PAGEREF _Toc396470010 \h </w:instrText>
             </w:r>
             <w:r>
               <w:rPr>
@@ -486,7 +486,7 @@
               <w:szCs w:val="22"/>
             </w:rPr>
           </w:pPr>
-          <w:hyperlink w:anchor="_Toc353986018" w:history="1">
+          <w:hyperlink w:anchor="_Toc396470011" w:history="1">
             <w:r>
               <w:rPr>
                 <w:rStyle w:val="Hyperlink"/>
@@ -515,7 +515,7 @@
                 <w:noProof/>
                 <w:webHidden/>
               </w:rPr>
-              <w:instrText xml:space="preserve"> PAGEREF _Toc353986018 \h </w:instrText>
+              <w:instrText xml:space="preserve"> PAGEREF _Toc396470011 \h </w:instrText>
             </w:r>
             <w:r>
               <w:rPr>
@@ -558,7 +558,7 @@
               <w:szCs w:val="22"/>
             </w:rPr>
           </w:pPr>
-          <w:hyperlink w:anchor="_Toc353986019" w:history="1">
+          <w:hyperlink w:anchor="_Toc396470012" w:history="1">
             <w:r>
               <w:rPr>
                 <w:rStyle w:val="Hyperlink"/>
@@ -587,7 +587,7 @@
                 <w:noProof/>
                 <w:webHidden/>
               </w:rPr>
-              <w:instrText xml:space="preserve"> PAGEREF _Toc353986019 \h </w:instrText>
+              <w:instrText xml:space="preserve"> PAGEREF _Toc396470012 \h </w:instrText>
             </w:r>
             <w:r>
               <w:rPr>
@@ -630,7 +630,7 @@
               <w:szCs w:val="22"/>
             </w:rPr>
           </w:pPr>
-          <w:hyperlink w:anchor="_Toc353986020" w:history="1">
+          <w:hyperlink w:anchor="_Toc396470013" w:history="1">
             <w:r>
               <w:rPr>
                 <w:rStyle w:val="Hyperlink"/>
@@ -659,7 +659,7 @@
                 <w:noProof/>
                 <w:webHidden/>
               </w:rPr>
-              <w:instrText xml:space="preserve"> PAGEREF _Toc353986020 \h </w:instrText>
+              <w:instrText xml:space="preserve"> PAGEREF _Toc396470013 \h </w:instrText>
             </w:r>
             <w:r>
               <w:rPr>
@@ -702,7 +702,7 @@
               <w:szCs w:val="22"/>
             </w:rPr>
           </w:pPr>
-          <w:hyperlink w:anchor="_Toc353986021" w:history="1">
+          <w:hyperlink w:anchor="_Toc396470014" w:history="1">
             <w:r>
               <w:rPr>
                 <w:rStyle w:val="Hyperlink"/>
@@ -731,7 +731,7 @@
                 <w:noProof/>
                 <w:webHidden/>
               </w:rPr>
-              <w:instrText xml:space="preserve"> PAGEREF _Toc353986021 \h </w:instrText>
+              <w:instrText xml:space="preserve"> PAGEREF _Toc396470014 \h </w:instrText>
             </w:r>
             <w:r>
               <w:rPr>
@@ -774,7 +774,7 @@
               <w:szCs w:val="22"/>
             </w:rPr>
           </w:pPr>
-          <w:hyperlink w:anchor="_Toc353986022" w:history="1">
+          <w:hyperlink w:anchor="_Toc396470015" w:history="1">
             <w:r>
               <w:rPr>
                 <w:rStyle w:val="Hyperlink"/>
@@ -803,7 +803,7 @@
                 <w:noProof/>
                 <w:webHidden/>
               </w:rPr>
-              <w:instrText xml:space="preserve"> PAGEREF _Toc353986022 \h </w:instrText>
+              <w:instrText xml:space="preserve"> PAGEREF _Toc396470015 \h </w:instrText>
             </w:r>
             <w:r>
               <w:rPr>
@@ -846,7 +846,7 @@
               <w:szCs w:val="22"/>
             </w:rPr>
           </w:pPr>
-          <w:hyperlink w:anchor="_Toc353986023" w:history="1">
+          <w:hyperlink w:anchor="_Toc396470016" w:history="1">
             <w:r>
               <w:rPr>
                 <w:rStyle w:val="Hyperlink"/>
@@ -875,7 +875,7 @@
                 <w:noProof/>
                 <w:webHidden/>
               </w:rPr>
-              <w:instrText xml:space="preserve"> PAGEREF _Toc353986023 \h </w:instrText>
+              <w:instrText xml:space="preserve"> PAGEREF _Toc396470016 \h </w:instrText>
             </w:r>
             <w:r>
               <w:rPr>
@@ -918,7 +918,7 @@
               <w:szCs w:val="22"/>
             </w:rPr>
           </w:pPr>
-          <w:hyperlink w:anchor="_Toc353986024" w:history="1">
+          <w:hyperlink w:anchor="_Toc396470017" w:history="1">
             <w:r>
               <w:rPr>
                 <w:rStyle w:val="Hyperlink"/>
@@ -947,7 +947,7 @@
                 <w:noProof/>
                 <w:webHidden/>
               </w:rPr>
-              <w:instrText xml:space="preserve"> PAGEREF _Toc353986024 \h </w:instrText>
+              <w:instrText xml:space="preserve"> PAGEREF _Toc396470017 \h </w:instrText>
             </w:r>
             <w:r>
               <w:rPr>
@@ -990,7 +990,7 @@
               <w:szCs w:val="22"/>
             </w:rPr>
           </w:pPr>
-          <w:hyperlink w:anchor="_Toc353986025" w:history="1">
+          <w:hyperlink w:anchor="_Toc396470018" w:history="1">
             <w:r>
               <w:rPr>
                 <w:rStyle w:val="Hyperlink"/>
@@ -1019,7 +1019,7 @@
                 <w:noProof/>
                 <w:webHidden/>
               </w:rPr>
-              <w:instrText xml:space="preserve"> PAGEREF _Toc353986025 \h </w:instrText>
+              <w:instrText xml:space="preserve"> PAGEREF _Toc396470018 \h </w:instrText>
             </w:r>
             <w:r>
               <w:rPr>
@@ -1062,7 +1062,7 @@
               <w:szCs w:val="22"/>
             </w:rPr>
           </w:pPr>
-          <w:hyperlink w:anchor="_Toc353986026" w:history="1">
+          <w:hyperlink w:anchor="_Toc396470019" w:history="1">
             <w:r>
               <w:rPr>
                 <w:rStyle w:val="Hyperlink"/>
@@ -1091,7 +1091,7 @@
                 <w:noProof/>
                 <w:webHidden/>
               </w:rPr>
-              <w:instrText xml:space="preserve"> PAGEREF _Toc353986026 \h </w:instrText>
+              <w:instrText xml:space="preserve"> PAGEREF _Toc396470019 \h </w:instrText>
             </w:r>
             <w:r>
               <w:rPr>
@@ -1134,7 +1134,7 @@
               <w:szCs w:val="22"/>
             </w:rPr>
           </w:pPr>
-          <w:hyperlink w:anchor="_Toc353986027" w:history="1">
+          <w:hyperlink w:anchor="_Toc396470020" w:history="1">
             <w:r>
               <w:rPr>
                 <w:rStyle w:val="Hyperlink"/>
@@ -1161,7 +1161,7 @@
                 <w:noProof/>
                 <w:webHidden/>
               </w:rPr>
-              <w:instrText xml:space="preserve"> PAGEREF _Toc353986027 \h </w:instrText>
+              <w:instrText xml:space="preserve"> PAGEREF _Toc396470020 \h </w:instrText>
             </w:r>
             <w:r>
               <w:rPr>
@@ -1204,7 +1204,7 @@
               <w:szCs w:val="22"/>
             </w:rPr>
           </w:pPr>
-          <w:hyperlink w:anchor="_Toc353986028" w:history="1">
+          <w:hyperlink w:anchor="_Toc396470021" w:history="1">
             <w:r>
               <w:rPr>
                 <w:rStyle w:val="Hyperlink"/>
@@ -1231,7 +1231,7 @@
                 <w:noProof/>
                 <w:webHidden/>
               </w:rPr>
-              <w:instrText xml:space="preserve"> PAGEREF _Toc353986028 \h </w:instrText>
+              <w:instrText xml:space="preserve"> PAGEREF _Toc396470021 \h </w:instrText>
             </w:r>
             <w:r>
               <w:rPr>
@@ -1274,7 +1274,7 @@
               <w:szCs w:val="22"/>
             </w:rPr>
           </w:pPr>
-          <w:hyperlink w:anchor="_Toc353986029" w:history="1">
+          <w:hyperlink w:anchor="_Toc396470022" w:history="1">
             <w:r>
               <w:rPr>
                 <w:rStyle w:val="Hyperlink"/>
@@ -1301,7 +1301,7 @@
                 <w:noProof/>
                 <w:webHidden/>
               </w:rPr>
-              <w:instrText xml:space="preserve"> PAGEREF _Toc353986029 \h </w:instrText>
+              <w:instrText xml:space="preserve"> PAGEREF _Toc396470022 \h </w:instrText>
             </w:r>
             <w:r>
               <w:rPr>
@@ -1344,7 +1344,7 @@
               <w:szCs w:val="22"/>
             </w:rPr>
           </w:pPr>
-          <w:hyperlink w:anchor="_Toc353986030" w:history="1">
+          <w:hyperlink w:anchor="_Toc396470023" w:history="1">
             <w:r>
               <w:rPr>
                 <w:rStyle w:val="Hyperlink"/>
@@ -1371,7 +1371,7 @@
                 <w:noProof/>
                 <w:webHidden/>
               </w:rPr>
-              <w:instrText xml:space="preserve"> PAGEREF _Toc353986030 \h </w:instrText>
+              <w:instrText xml:space="preserve"> PAGEREF _Toc396470023 \h </w:instrText>
             </w:r>
             <w:r>
               <w:rPr>
@@ -1414,7 +1414,7 @@
               <w:szCs w:val="22"/>
             </w:rPr>
           </w:pPr>
-          <w:hyperlink w:anchor="_Toc353986031" w:history="1">
+          <w:hyperlink w:anchor="_Toc396470024" w:history="1">
             <w:r>
               <w:rPr>
                 <w:rStyle w:val="Hyperlink"/>
@@ -1441,7 +1441,7 @@
                 <w:noProof/>
                 <w:webHidden/>
               </w:rPr>
-              <w:instrText xml:space="preserve"> PAGEREF _Toc353986031 \h </w:instrText>
+              <w:instrText xml:space="preserve"> PAGEREF _Toc396470024 \h </w:instrText>
             </w:r>
             <w:r>
               <w:rPr>
@@ -1484,7 +1484,7 @@
               <w:szCs w:val="22"/>
             </w:rPr>
           </w:pPr>
-          <w:hyperlink w:anchor="_Toc353986032" w:history="1">
+          <w:hyperlink w:anchor="_Toc396470025" w:history="1">
             <w:r>
               <w:rPr>
                 <w:rStyle w:val="Hyperlink"/>
@@ -1511,7 +1511,7 @@
                 <w:noProof/>
                 <w:webHidden/>
               </w:rPr>
-              <w:instrText xml:space="preserve"> PAGEREF _Toc353986032 \h </w:instrText>
+              <w:instrText xml:space="preserve"> PAGEREF _Toc396470025 \h </w:instrText>
             </w:r>
             <w:r>
               <w:rPr>
@@ -1554,7 +1554,7 @@
               <w:szCs w:val="22"/>
             </w:rPr>
           </w:pPr>
-          <w:hyperlink w:anchor="_Toc353986033" w:history="1">
+          <w:hyperlink w:anchor="_Toc396470026" w:history="1">
             <w:r>
               <w:rPr>
                 <w:rStyle w:val="Hyperlink"/>
@@ -1581,7 +1581,7 @@
                 <w:noProof/>
                 <w:webHidden/>
               </w:rPr>
-              <w:instrText xml:space="preserve"> PAGEREF _Toc353986033 \h </w:instrText>
+              <w:instrText xml:space="preserve"> PAGEREF _Toc396470026 \h </w:instrText>
             </w:r>
             <w:r>
               <w:rPr>
@@ -1624,7 +1624,7 @@
               <w:szCs w:val="22"/>
             </w:rPr>
           </w:pPr>
-          <w:hyperlink w:anchor="_Toc353986034" w:history="1">
+          <w:hyperlink w:anchor="_Toc396470027" w:history="1">
             <w:r>
               <w:rPr>
                 <w:rStyle w:val="Hyperlink"/>
@@ -1651,7 +1651,7 @@
                 <w:noProof/>
                 <w:webHidden/>
               </w:rPr>
-              <w:instrText xml:space="preserve"> PAGEREF _Toc353986034 \h </w:instrText>
+              <w:instrText xml:space="preserve"> PAGEREF _Toc396470027 \h </w:instrText>
             </w:r>
             <w:r>
               <w:rPr>
@@ -1694,7 +1694,7 @@
               <w:szCs w:val="22"/>
             </w:rPr>
           </w:pPr>
-          <w:hyperlink w:anchor="_Toc353986035" w:history="1">
+          <w:hyperlink w:anchor="_Toc396470028" w:history="1">
             <w:r>
               <w:rPr>
                 <w:rStyle w:val="Hyperlink"/>
@@ -1721,7 +1721,7 @@
                 <w:noProof/>
                 <w:webHidden/>
               </w:rPr>
-              <w:instrText xml:space="preserve"> PAGEREF _Toc353986035 \h </w:instrText>
+              <w:instrText xml:space="preserve"> PAGEREF _Toc396470028 \h </w:instrText>
             </w:r>
             <w:r>
               <w:rPr>
@@ -1764,7 +1764,7 @@
               <w:szCs w:val="22"/>
             </w:rPr>
           </w:pPr>
-          <w:hyperlink w:anchor="_Toc353986036" w:history="1">
+          <w:hyperlink w:anchor="_Toc396470029" w:history="1">
             <w:r>
               <w:rPr>
                 <w:rStyle w:val="Hyperlink"/>
@@ -1791,7 +1791,7 @@
                 <w:noProof/>
                 <w:webHidden/>
               </w:rPr>
-              <w:instrText xml:space="preserve"> PAGEREF _Toc353986036 \h </w:instrText>
+              <w:instrText xml:space="preserve"> PAGEREF _Toc396470029 \h </w:instrText>
             </w:r>
             <w:r>
               <w:rPr>
@@ -1834,7 +1834,7 @@
               <w:szCs w:val="22"/>
             </w:rPr>
           </w:pPr>
-          <w:hyperlink w:anchor="_Toc353986037" w:history="1">
+          <w:hyperlink w:anchor="_Toc396470030" w:history="1">
             <w:r>
               <w:rPr>
                 <w:rStyle w:val="Hyperlink"/>
@@ -1861,7 +1861,7 @@
                 <w:noProof/>
                 <w:webHidden/>
               </w:rPr>
-              <w:instrText xml:space="preserve"> PAGEREF _Toc353986037 \h </w:instrText>
+              <w:instrText xml:space="preserve"> PAGEREF _Toc396470030 \h </w:instrText>
             </w:r>
             <w:r>
               <w:rPr>
@@ -1904,7 +1904,7 @@
               <w:szCs w:val="22"/>
             </w:rPr>
           </w:pPr>
-          <w:hyperlink w:anchor="_Toc353986038" w:history="1">
+          <w:hyperlink w:anchor="_Toc396470031" w:history="1">
             <w:r>
               <w:rPr>
                 <w:rStyle w:val="Hyperlink"/>
@@ -1931,7 +1931,7 @@
                 <w:noProof/>
                 <w:webHidden/>
               </w:rPr>
-              <w:instrText xml:space="preserve"> PAGEREF _Toc353986038 \h </w:instrText>
+              <w:instrText xml:space="preserve"> PAGEREF _Toc396470031 \h </w:instrText>
             </w:r>
             <w:r>
               <w:rPr>
@@ -1974,7 +1974,7 @@
               <w:szCs w:val="22"/>
             </w:rPr>
           </w:pPr>
-          <w:hyperlink w:anchor="_Toc353986039" w:history="1">
+          <w:hyperlink w:anchor="_Toc396470032" w:history="1">
             <w:r>
               <w:rPr>
                 <w:rStyle w:val="Hyperlink"/>
@@ -2001,7 +2001,7 @@
                 <w:noProof/>
                 <w:webHidden/>
               </w:rPr>
-              <w:instrText xml:space="preserve"> PAGEREF _Toc353986039 \h </w:instrText>
+              <w:instrText xml:space="preserve"> PAGEREF _Toc396470032 \h </w:instrText>
             </w:r>
             <w:r>
               <w:rPr>
@@ -2044,7 +2044,7 @@
               <w:szCs w:val="22"/>
             </w:rPr>
           </w:pPr>
-          <w:hyperlink w:anchor="_Toc353986040" w:history="1">
+          <w:hyperlink w:anchor="_Toc396470033" w:history="1">
             <w:r>
               <w:rPr>
                 <w:rStyle w:val="Hyperlink"/>
@@ -2071,7 +2071,7 @@
                 <w:noProof/>
                 <w:webHidden/>
               </w:rPr>
-              <w:instrText xml:space="preserve"> PAGEREF _Toc353986040 \h </w:instrText>
+              <w:instrText xml:space="preserve"> PAGEREF _Toc396470033 \h </w:instrText>
             </w:r>
             <w:r>
               <w:rPr>
@@ -2114,7 +2114,7 @@
               <w:szCs w:val="22"/>
             </w:rPr>
           </w:pPr>
-          <w:hyperlink w:anchor="_Toc353986041" w:history="1">
+          <w:hyperlink w:anchor="_Toc396470034" w:history="1">
             <w:r>
               <w:rPr>
                 <w:rStyle w:val="Hyperlink"/>
@@ -2141,7 +2141,7 @@
                 <w:noProof/>
                 <w:webHidden/>
               </w:rPr>
-              <w:instrText xml:space="preserve"> PAGEREF _Toc353986041 \h </w:instrText>
+              <w:instrText xml:space="preserve"> PAGEREF _Toc396470034 \h </w:instrText>
             </w:r>
             <w:r>
               <w:rPr>
@@ -2184,7 +2184,7 @@
               <w:szCs w:val="22"/>
             </w:rPr>
           </w:pPr>
-          <w:hyperlink w:anchor="_Toc353986042" w:history="1">
+          <w:hyperlink w:anchor="_Toc396470035" w:history="1">
             <w:r>
               <w:rPr>
                 <w:rStyle w:val="Hyperlink"/>
@@ -2211,7 +2211,7 @@
                 <w:noProof/>
                 <w:webHidden/>
               </w:rPr>
-              <w:instrText xml:space="preserve"> PAGEREF _Toc353986042 \h </w:instrText>
+              <w:instrText xml:space="preserve"> PAGEREF _Toc396470035 \h </w:instrText>
             </w:r>
             <w:r>
               <w:rPr>
@@ -2254,7 +2254,7 @@
               <w:szCs w:val="22"/>
             </w:rPr>
           </w:pPr>
-          <w:hyperlink w:anchor="_Toc353986043" w:history="1">
+          <w:hyperlink w:anchor="_Toc396470036" w:history="1">
             <w:r>
               <w:rPr>
                 <w:rStyle w:val="Hyperlink"/>
@@ -2281,7 +2281,7 @@
                 <w:noProof/>
                 <w:webHidden/>
               </w:rPr>
-              <w:instrText xml:space="preserve"> PAGEREF _Toc353986043 \h </w:instrText>
+              <w:instrText xml:space="preserve"> PAGEREF _Toc396470036 \h </w:instrText>
             </w:r>
             <w:r>
               <w:rPr>
@@ -2324,7 +2324,7 @@
               <w:szCs w:val="22"/>
             </w:rPr>
           </w:pPr>
-          <w:hyperlink w:anchor="_Toc353986044" w:history="1">
+          <w:hyperlink w:anchor="_Toc396470037" w:history="1">
             <w:r>
               <w:rPr>
                 <w:rStyle w:val="Hyperlink"/>
@@ -2351,7 +2351,7 @@
                 <w:noProof/>
                 <w:webHidden/>
               </w:rPr>
-              <w:instrText xml:space="preserve"> PAGEREF _Toc353986044 \h </w:instrText>
+              <w:instrText xml:space="preserve"> PAGEREF _Toc396470037 \h </w:instrText>
             </w:r>
             <w:r>
               <w:rPr>
@@ -2394,7 +2394,7 @@
               <w:szCs w:val="22"/>
             </w:rPr>
           </w:pPr>
-          <w:hyperlink w:anchor="_Toc353986045" w:history="1">
+          <w:hyperlink w:anchor="_Toc396470038" w:history="1">
             <w:r>
               <w:rPr>
                 <w:rStyle w:val="Hyperlink"/>
@@ -2421,7 +2421,7 @@
                 <w:noProof/>
                 <w:webHidden/>
               </w:rPr>
-              <w:instrText xml:space="preserve"> PAGEREF _Toc353986045 \h </w:instrText>
+              <w:instrText xml:space="preserve"> PAGEREF _Toc396470038 \h </w:instrText>
             </w:r>
             <w:r>
               <w:rPr>
@@ -2464,7 +2464,7 @@
               <w:szCs w:val="22"/>
             </w:rPr>
           </w:pPr>
-          <w:hyperlink w:anchor="_Toc353986046" w:history="1">
+          <w:hyperlink w:anchor="_Toc396470039" w:history="1">
             <w:r>
               <w:rPr>
                 <w:rStyle w:val="Hyperlink"/>
@@ -2491,7 +2491,7 @@
                 <w:noProof/>
                 <w:webHidden/>
               </w:rPr>
-              <w:instrText xml:space="preserve"> PAGEREF _Toc353986046 \h </w:instrText>
+              <w:instrText xml:space="preserve"> PAGEREF _Toc396470039 \h </w:instrText>
             </w:r>
             <w:r>
               <w:rPr>
@@ -2534,7 +2534,7 @@
               <w:szCs w:val="22"/>
             </w:rPr>
           </w:pPr>
-          <w:hyperlink w:anchor="_Toc353986047" w:history="1">
+          <w:hyperlink w:anchor="_Toc396470040" w:history="1">
             <w:r>
               <w:rPr>
                 <w:rStyle w:val="Hyperlink"/>
@@ -2561,7 +2561,7 @@
                 <w:noProof/>
                 <w:webHidden/>
               </w:rPr>
-              <w:instrText xml:space="preserve"> PAGEREF _Toc353986047 \h </w:instrText>
+              <w:instrText xml:space="preserve"> PAGEREF _Toc396470040 \h </w:instrText>
             </w:r>
             <w:r>
               <w:rPr>
@@ -2604,7 +2604,7 @@
               <w:szCs w:val="22"/>
             </w:rPr>
           </w:pPr>
-          <w:hyperlink w:anchor="_Toc353986048" w:history="1">
+          <w:hyperlink w:anchor="_Toc396470041" w:history="1">
             <w:r>
               <w:rPr>
                 <w:rStyle w:val="Hyperlink"/>
@@ -2631,7 +2631,7 @@
                 <w:noProof/>
                 <w:webHidden/>
               </w:rPr>
-              <w:instrText xml:space="preserve"> PAGEREF _Toc353986048 \h </w:instrText>
+              <w:instrText xml:space="preserve"> PAGEREF _Toc396470041 \h </w:instrText>
             </w:r>
             <w:r>
               <w:rPr>
@@ -2674,7 +2674,7 @@
               <w:szCs w:val="22"/>
             </w:rPr>
           </w:pPr>
-          <w:hyperlink w:anchor="_Toc353986049" w:history="1">
+          <w:hyperlink w:anchor="_Toc396470042" w:history="1">
             <w:r>
               <w:rPr>
                 <w:rStyle w:val="Hyperlink"/>
@@ -2701,7 +2701,7 @@
                 <w:noProof/>
                 <w:webHidden/>
               </w:rPr>
-              <w:instrText xml:space="preserve"> PAGEREF _Toc353986049 \h </w:instrText>
+              <w:instrText xml:space="preserve"> PAGEREF _Toc396470042 \h </w:instrText>
             </w:r>
             <w:r>
               <w:rPr>
@@ -2744,7 +2744,7 @@
               <w:szCs w:val="22"/>
             </w:rPr>
           </w:pPr>
-          <w:hyperlink w:anchor="_Toc353986050" w:history="1">
+          <w:hyperlink w:anchor="_Toc396470043" w:history="1">
             <w:r>
               <w:rPr>
                 <w:rStyle w:val="Hyperlink"/>
@@ -2771,7 +2771,7 @@
                 <w:noProof/>
                 <w:webHidden/>
               </w:rPr>
-              <w:instrText xml:space="preserve"> PAGEREF _Toc353986050 \h </w:instrText>
+              <w:instrText xml:space="preserve"> PAGEREF _Toc396470043 \h </w:instrText>
             </w:r>
             <w:r>
               <w:rPr>
@@ -2814,7 +2814,7 @@
               <w:szCs w:val="22"/>
             </w:rPr>
           </w:pPr>
-          <w:hyperlink w:anchor="_Toc353986051" w:history="1">
+          <w:hyperlink w:anchor="_Toc396470044" w:history="1">
             <w:r>
               <w:rPr>
                 <w:rStyle w:val="Hyperlink"/>
@@ -2841,7 +2841,7 @@
                 <w:noProof/>
                 <w:webHidden/>
               </w:rPr>
-              <w:instrText xml:space="preserve"> PAGEREF _Toc353986051 \h </w:instrText>
+              <w:instrText xml:space="preserve"> PAGEREF _Toc396470044 \h </w:instrText>
             </w:r>
             <w:r>
               <w:rPr>
@@ -2884,7 +2884,7 @@
               <w:szCs w:val="22"/>
             </w:rPr>
           </w:pPr>
-          <w:hyperlink w:anchor="_Toc353986052" w:history="1">
+          <w:hyperlink w:anchor="_Toc396470045" w:history="1">
             <w:r>
               <w:rPr>
                 <w:rStyle w:val="Hyperlink"/>
@@ -2911,7 +2911,7 @@
                 <w:noProof/>
                 <w:webHidden/>
               </w:rPr>
-              <w:instrText xml:space="preserve"> PAGEREF _Toc353986052 \h </w:instrText>
+              <w:instrText xml:space="preserve"> PAGEREF _Toc396470045 \h </w:instrText>
             </w:r>
             <w:r>
               <w:rPr>
@@ -2954,7 +2954,7 @@
               <w:szCs w:val="22"/>
             </w:rPr>
           </w:pPr>
-          <w:hyperlink w:anchor="_Toc353986053" w:history="1">
+          <w:hyperlink w:anchor="_Toc396470046" w:history="1">
             <w:r>
               <w:rPr>
                 <w:rStyle w:val="Hyperlink"/>
@@ -2981,7 +2981,7 @@
                 <w:noProof/>
                 <w:webHidden/>
               </w:rPr>
-              <w:instrText xml:space="preserve"> PAGEREF _Toc353986053 \h </w:instrText>
+              <w:instrText xml:space="preserve"> PAGEREF _Toc396470046 \h </w:instrText>
             </w:r>
             <w:r>
               <w:rPr>
@@ -3024,7 +3024,7 @@
               <w:szCs w:val="22"/>
             </w:rPr>
           </w:pPr>
-          <w:hyperlink w:anchor="_Toc353986054" w:history="1">
+          <w:hyperlink w:anchor="_Toc396470047" w:history="1">
             <w:r>
               <w:rPr>
                 <w:rStyle w:val="Hyperlink"/>
@@ -3051,7 +3051,7 @@
                 <w:noProof/>
                 <w:webHidden/>
               </w:rPr>
-              <w:instrText xml:space="preserve"> PAGEREF _Toc353986054 \h </w:instrText>
+              <w:instrText xml:space="preserve"> PAGEREF _Toc396470047 \h </w:instrText>
             </w:r>
             <w:r>
               <w:rPr>
@@ -3094,7 +3094,7 @@
               <w:szCs w:val="22"/>
             </w:rPr>
           </w:pPr>
-          <w:hyperlink w:anchor="_Toc353986055" w:history="1">
+          <w:hyperlink w:anchor="_Toc396470048" w:history="1">
             <w:r>
               <w:rPr>
                 <w:rStyle w:val="Hyperlink"/>
@@ -3121,7 +3121,7 @@
                 <w:noProof/>
                 <w:webHidden/>
               </w:rPr>
-              <w:instrText xml:space="preserve"> PAGEREF _Toc353986055 \h </w:instrText>
+              <w:instrText xml:space="preserve"> PAGEREF _Toc396470048 \h </w:instrText>
             </w:r>
             <w:r>
               <w:rPr>
@@ -3164,7 +3164,7 @@
               <w:szCs w:val="22"/>
             </w:rPr>
           </w:pPr>
-          <w:hyperlink w:anchor="_Toc353986056" w:history="1">
+          <w:hyperlink w:anchor="_Toc396470049" w:history="1">
             <w:r>
               <w:rPr>
                 <w:rStyle w:val="Hyperlink"/>
@@ -3191,7 +3191,7 @@
                 <w:noProof/>
                 <w:webHidden/>
               </w:rPr>
-              <w:instrText xml:space="preserve"> PAGEREF _Toc353986056 \h </w:instrText>
+              <w:instrText xml:space="preserve"> PAGEREF _Toc396470049 \h </w:instrText>
             </w:r>
             <w:r>
               <w:rPr>
@@ -3234,13 +3234,13 @@
               <w:szCs w:val="22"/>
             </w:rPr>
           </w:pPr>
-          <w:hyperlink w:anchor="_Toc353986057" w:history="1">
+          <w:hyperlink w:anchor="_Toc396470050" w:history="1">
             <w:r>
               <w:rPr>
                 <w:rStyle w:val="Hyperlink"/>
                 <w:noProof/>
               </w:rPr>
-              <w:t>Version control system</w:t>
+              <w:t>Creating Packages</w:t>
             </w:r>
             <w:r>
               <w:rPr>
@@ -3261,7 +3261,7 @@
                 <w:noProof/>
                 <w:webHidden/>
               </w:rPr>
-              <w:instrText xml:space="preserve"> PAGEREF _Toc353986057 \h </w:instrText>
+              <w:instrText xml:space="preserve"> PAGEREF _Toc396470050 \h </w:instrText>
             </w:r>
             <w:r>
               <w:rPr>
@@ -3304,13 +3304,13 @@
               <w:szCs w:val="22"/>
             </w:rPr>
           </w:pPr>
-          <w:hyperlink w:anchor="_Toc353986058" w:history="1">
+          <w:hyperlink w:anchor="_Toc396470051" w:history="1">
             <w:r>
               <w:rPr>
                 <w:rStyle w:val="Hyperlink"/>
                 <w:noProof/>
               </w:rPr>
-              <w:t>Vcs API</w:t>
+              <w:t>The Packaging API</w:t>
             </w:r>
             <w:r>
               <w:rPr>
@@ -3331,7 +3331,7 @@
                 <w:noProof/>
                 <w:webHidden/>
               </w:rPr>
-              <w:instrText xml:space="preserve"> PAGEREF _Toc353986058 \h </w:instrText>
+              <w:instrText xml:space="preserve"> PAGEREF _Toc396470051 \h </w:instrText>
             </w:r>
             <w:r>
               <w:rPr>
@@ -3374,13 +3374,13 @@
               <w:szCs w:val="22"/>
             </w:rPr>
           </w:pPr>
-          <w:hyperlink w:anchor="_Toc353986059" w:history="1">
+          <w:hyperlink w:anchor="_Toc396470052" w:history="1">
             <w:r>
               <w:rPr>
                 <w:rStyle w:val="Hyperlink"/>
                 <w:noProof/>
               </w:rPr>
-              <w:t>Testing</w:t>
+              <w:t>Version control system</w:t>
             </w:r>
             <w:r>
               <w:rPr>
@@ -3401,7 +3401,7 @@
                 <w:noProof/>
                 <w:webHidden/>
               </w:rPr>
-              <w:instrText xml:space="preserve"> PAGEREF _Toc353986059 \h </w:instrText>
+              <w:instrText xml:space="preserve"> PAGEREF _Toc396470052 \h </w:instrText>
             </w:r>
             <w:r>
               <w:rPr>
@@ -3421,7 +3421,77 @@
                 <w:noProof/>
                 <w:webHidden/>
               </w:rPr>
-              <w:t>52</w:t>
+              <w:t>57</w:t>
+            </w:r>
+            <w:r>
+              <w:rPr>
+                <w:noProof/>
+                <w:webHidden/>
+              </w:rPr>
+              <w:fldChar w:fldCharType="end"/>
+            </w:r>
+          </w:hyperlink>
+        </w:p>
+        <w:p>
+          <w:pPr>
+            <w:pStyle w:val="TOC3"/>
+            <w:tabs>
+              <w:tab w:val="right" w:leader="dot" w:pos="9350"/>
+            </w:tabs>
+            <w:rPr>
+              <w:noProof/>
+              <w:sz w:val="22"/>
+              <w:szCs w:val="22"/>
+            </w:rPr>
+          </w:pPr>
+          <w:hyperlink w:anchor="_Toc396470053" w:history="1">
+            <w:r>
+              <w:rPr>
+                <w:rStyle w:val="Hyperlink"/>
+                <w:noProof/>
+              </w:rPr>
+              <w:t>Vcs API</w:t>
+            </w:r>
+            <w:r>
+              <w:rPr>
+                <w:noProof/>
+                <w:webHidden/>
+              </w:rPr>
+              <w:tab/>
+            </w:r>
+            <w:r>
+              <w:rPr>
+                <w:noProof/>
+                <w:webHidden/>
+              </w:rPr>
+              <w:fldChar w:fldCharType="begin"/>
+            </w:r>
+            <w:r>
+              <w:rPr>
+                <w:noProof/>
+                <w:webHidden/>
+              </w:rPr>
+              <w:instrText xml:space="preserve"> PAGEREF _Toc396470053 \h </w:instrText>
+            </w:r>
+            <w:r>
+              <w:rPr>
+                <w:noProof/>
+                <w:webHidden/>
+              </w:rPr>
+            </w:r>
+            <w:r>
+              <w:rPr>
+                <w:noProof/>
+                <w:webHidden/>
+              </w:rPr>
+              <w:fldChar w:fldCharType="separate"/>
+            </w:r>
+            <w:r>
+              <w:rPr>
+                <w:noProof/>
+                <w:webHidden/>
+              </w:rPr>
+              <w:t>57</w:t>
             </w:r>
             <w:r>
               <w:rPr>
@@ -3444,12 +3514,82 @@
               <w:szCs w:val="22"/>
             </w:rPr>
           </w:pPr>
-          <w:hyperlink w:anchor="_Toc353986060" w:history="1">
+          <w:hyperlink w:anchor="_Toc396470054" w:history="1">
             <w:r>
               <w:rPr>
                 <w:rStyle w:val="Hyperlink"/>
                 <w:noProof/>
               </w:rPr>
+              <w:t>Testing</w:t>
+            </w:r>
+            <w:r>
+              <w:rPr>
+                <w:noProof/>
+                <w:webHidden/>
+              </w:rPr>
+              <w:tab/>
+            </w:r>
+            <w:r>
+              <w:rPr>
+                <w:noProof/>
+                <w:webHidden/>
+              </w:rPr>
+              <w:fldChar w:fldCharType="begin"/>
+            </w:r>
+            <w:r>
+              <w:rPr>
+                <w:noProof/>
+                <w:webHidden/>
+              </w:rPr>
+              <w:instrText xml:space="preserve"> PAGEREF _Toc396470054 \h </w:instrText>
+            </w:r>
+            <w:r>
+              <w:rPr>
+                <w:noProof/>
+                <w:webHidden/>
+              </w:rPr>
+            </w:r>
+            <w:r>
+              <w:rPr>
+                <w:noProof/>
+                <w:webHidden/>
+              </w:rPr>
+              <w:fldChar w:fldCharType="separate"/>
+            </w:r>
+            <w:r>
+              <w:rPr>
+                <w:noProof/>
+                <w:webHidden/>
+              </w:rPr>
+              <w:t>61</w:t>
+            </w:r>
+            <w:r>
+              <w:rPr>
+                <w:noProof/>
+                <w:webHidden/>
+              </w:rPr>
+              <w:fldChar w:fldCharType="end"/>
+            </w:r>
+          </w:hyperlink>
+        </w:p>
+        <w:p>
+          <w:pPr>
+            <w:pStyle w:val="TOC2"/>
+            <w:tabs>
+              <w:tab w:val="right" w:leader="dot" w:pos="9350"/>
+            </w:tabs>
+            <w:rPr>
+              <w:noProof/>
+              <w:sz w:val="22"/>
+              <w:szCs w:val="22"/>
+            </w:rPr>
+          </w:pPr>
+          <w:hyperlink w:anchor="_Toc396470055" w:history="1">
+            <w:r>
+              <w:rPr>
+                <w:rStyle w:val="Hyperlink"/>
+                <w:noProof/>
+              </w:rPr>
               <w:t>Python script runner</w:t>
             </w:r>
             <w:r>
@@ -3471,7 +3611,7 @@
                 <w:noProof/>
                 <w:webHidden/>
               </w:rPr>
-              <w:instrText xml:space="preserve"> PAGEREF _Toc353986060 \h </w:instrText>
+              <w:instrText xml:space="preserve"> PAGEREF _Toc396470055 \h </w:instrText>
             </w:r>
             <w:r>
               <w:rPr>
@@ -3491,7 +3631,7 @@
                 <w:noProof/>
                 <w:webHidden/>
               </w:rPr>
-              <w:t>54</w:t>
+              <w:t>63</w:t>
             </w:r>
             <w:r>
               <w:rPr>
@@ -3514,7 +3654,7 @@
               <w:szCs w:val="22"/>
             </w:rPr>
           </w:pPr>
-          <w:hyperlink w:anchor="_Toc353986061" w:history="1">
+          <w:hyperlink w:anchor="_Toc396470056" w:history="1">
             <w:r>
               <w:rPr>
                 <w:rStyle w:val="Hyperlink"/>
@@ -3541,7 +3681,7 @@
                 <w:noProof/>
                 <w:webHidden/>
               </w:rPr>
-              <w:instrText xml:space="preserve"> PAGEREF _Toc353986061 \h </w:instrText>
+              <w:instrText xml:space="preserve"> PAGEREF _Toc396470056 \h </w:instrText>
             </w:r>
             <w:r>
               <w:rPr>
@@ -3561,7 +3701,7 @@
                 <w:noProof/>
                 <w:webHidden/>
               </w:rPr>
-              <w:t>54</w:t>
+              <w:t>63</w:t>
             </w:r>
             <w:r>
               <w:rPr>
@@ -3584,7 +3724,7 @@
               <w:szCs w:val="22"/>
             </w:rPr>
           </w:pPr>
-          <w:hyperlink w:anchor="_Toc353986062" w:history="1">
+          <w:hyperlink w:anchor="_Toc396470057" w:history="1">
             <w:r>
               <w:rPr>
                 <w:rStyle w:val="Hyperlink"/>
@@ -3611,7 +3751,7 @@
                 <w:noProof/>
                 <w:webHidden/>
               </w:rPr>
-              <w:instrText xml:space="preserve"> PAGEREF _Toc353986062 \h </w:instrText>
+              <w:instrText xml:space="preserve"> PAGEREF _Toc396470057 \h </w:instrText>
             </w:r>
             <w:r>
               <w:rPr>
@@ -3631,7 +3771,7 @@
                 <w:noProof/>
                 <w:webHidden/>
               </w:rPr>
-              <w:t>55</w:t>
+              <w:t>64</w:t>
             </w:r>
             <w:r>
               <w:rPr>
@@ -3654,7 +3794,7 @@
               <w:szCs w:val="22"/>
             </w:rPr>
           </w:pPr>
-          <w:hyperlink w:anchor="_Toc353986063" w:history="1">
+          <w:hyperlink w:anchor="_Toc396470058" w:history="1">
             <w:r>
               <w:rPr>
                 <w:rStyle w:val="Hyperlink"/>
@@ -3681,7 +3821,7 @@
                 <w:noProof/>
                 <w:webHidden/>
               </w:rPr>
-              <w:instrText xml:space="preserve"> PAGEREF _Toc353986063 \h </w:instrText>
+              <w:instrText xml:space="preserve"> PAGEREF _Toc396470058 \h </w:instrText>
             </w:r>
             <w:r>
               <w:rPr>
@@ -3701,7 +3841,7 @@
                 <w:noProof/>
                 <w:webHidden/>
               </w:rPr>
-              <w:t>55</w:t>
+              <w:t>64</w:t>
             </w:r>
             <w:r>
               <w:rPr>
@@ -3724,7 +3864,7 @@
               <w:szCs w:val="22"/>
             </w:rPr>
           </w:pPr>
-          <w:hyperlink w:anchor="_Toc353986064" w:history="1">
+          <w:hyperlink w:anchor="_Toc396470059" w:history="1">
             <w:r>
               <w:rPr>
                 <w:rStyle w:val="Hyperlink"/>
@@ -3751,7 +3891,7 @@
                 <w:noProof/>
                 <w:webHidden/>
               </w:rPr>
-              <w:instrText xml:space="preserve"> PAGEREF _Toc353986064 \h </w:instrText>
+              <w:instrText xml:space="preserve"> PAGEREF _Toc396470059 \h </w:instrText>
             </w:r>
             <w:r>
               <w:rPr>
@@ -3771,7 +3911,7 @@
                 <w:noProof/>
                 <w:webHidden/>
               </w:rPr>
-              <w:t>55</w:t>
+              <w:t>64</w:t>
             </w:r>
             <w:r>
               <w:rPr>
@@ -3794,7 +3934,7 @@
               <w:szCs w:val="22"/>
             </w:rPr>
           </w:pPr>
-          <w:hyperlink w:anchor="_Toc353986065" w:history="1">
+          <w:hyperlink w:anchor="_Toc396470060" w:history="1">
             <w:r>
               <w:rPr>
                 <w:rStyle w:val="Hyperlink"/>
@@ -3821,7 +3961,7 @@
                 <w:noProof/>
                 <w:webHidden/>
               </w:rPr>
-              <w:instrText xml:space="preserve"> PAGEREF _Toc353986065 \h </w:instrText>
+              <w:instrText xml:space="preserve"> PAGEREF _Toc396470060 \h </w:instrText>
             </w:r>
             <w:r>
               <w:rPr>
@@ -3841,7 +3981,7 @@
                 <w:noProof/>
                 <w:webHidden/>
               </w:rPr>
-              <w:t>56</w:t>
+              <w:t>65</w:t>
             </w:r>
             <w:r>
               <w:rPr>
@@ -3864,7 +4004,7 @@
               <w:szCs w:val="22"/>
             </w:rPr>
           </w:pPr>
-          <w:hyperlink w:anchor="_Toc353986066" w:history="1">
+          <w:hyperlink w:anchor="_Toc396470061" w:history="1">
             <w:r>
               <w:rPr>
                 <w:rStyle w:val="Hyperlink"/>
@@ -3891,7 +4031,7 @@
                 <w:noProof/>
                 <w:webHidden/>
               </w:rPr>
-              <w:instrText xml:space="preserve"> PAGEREF _Toc353986066 \h </w:instrText>
+              <w:instrText xml:space="preserve"> PAGEREF _Toc396470061 \h </w:instrText>
             </w:r>
             <w:r>
               <w:rPr>
@@ -3911,7 +4051,7 @@
                 <w:noProof/>
                 <w:webHidden/>
               </w:rPr>
-              <w:t>56</w:t>
+              <w:t>65</w:t>
             </w:r>
             <w:r>
               <w:rPr>
@@ -3934,7 +4074,7 @@
               <w:szCs w:val="22"/>
             </w:rPr>
           </w:pPr>
-          <w:hyperlink w:anchor="_Toc353986067" w:history="1">
+          <w:hyperlink w:anchor="_Toc396470062" w:history="1">
             <w:r>
               <w:rPr>
                 <w:rStyle w:val="Hyperlink"/>
@@ -3961,7 +4101,7 @@
                 <w:noProof/>
                 <w:webHidden/>
               </w:rPr>
-              <w:instrText xml:space="preserve"> PAGEREF _Toc353986067 \h </w:instrText>
+              <w:instrText xml:space="preserve"> PAGEREF _Toc396470062 \h </w:instrText>
             </w:r>
             <w:r>
               <w:rPr>
@@ -3981,7 +4121,7 @@
                 <w:noProof/>
                 <w:webHidden/>
               </w:rPr>
-              <w:t>56</w:t>
+              <w:t>65</w:t>
             </w:r>
             <w:r>
               <w:rPr>
@@ -4004,7 +4144,7 @@
               <w:szCs w:val="22"/>
             </w:rPr>
           </w:pPr>
-          <w:hyperlink w:anchor="_Toc353986068" w:history="1">
+          <w:hyperlink w:anchor="_Toc396470063" w:history="1">
             <w:r>
               <w:rPr>
                 <w:rStyle w:val="Hyperlink"/>
@@ -4031,7 +4171,7 @@
                 <w:noProof/>
                 <w:webHidden/>
               </w:rPr>
-              <w:instrText xml:space="preserve"> PAGEREF _Toc353986068 \h </w:instrText>
+              <w:instrText xml:space="preserve"> PAGEREF _Toc396470063 \h </w:instrText>
             </w:r>
             <w:r>
               <w:rPr>
@@ -4051,7 +4191,7 @@
                 <w:noProof/>
                 <w:webHidden/>
               </w:rPr>
-              <w:t>58</w:t>
+              <w:t>67</w:t>
             </w:r>
             <w:r>
               <w:rPr>
@@ -4074,7 +4214,7 @@
               <w:szCs w:val="22"/>
             </w:rPr>
           </w:pPr>
-          <w:hyperlink w:anchor="_Toc353986069" w:history="1">
+          <w:hyperlink w:anchor="_Toc396470064" w:history="1">
             <w:r>
               <w:rPr>
                 <w:rStyle w:val="Hyperlink"/>
@@ -4101,7 +4241,7 @@
                 <w:noProof/>
                 <w:webHidden/>
               </w:rPr>
-              <w:instrText xml:space="preserve"> PAGEREF _Toc353986069 \h </w:instrText>
+              <w:instrText xml:space="preserve"> PAGEREF _Toc396470064 \h </w:instrText>
             </w:r>
             <w:r>
               <w:rPr>
@@ -4121,7 +4261,7 @@
                 <w:noProof/>
                 <w:webHidden/>
               </w:rPr>
-              <w:t>58</w:t>
+              <w:t>67</w:t>
             </w:r>
             <w:r>
               <w:rPr>
@@ -4144,7 +4284,7 @@
               <w:szCs w:val="22"/>
             </w:rPr>
           </w:pPr>
-          <w:hyperlink w:anchor="_Toc353986070" w:history="1">
+          <w:hyperlink w:anchor="_Toc396470065" w:history="1">
             <w:r>
               <w:rPr>
                 <w:rStyle w:val="Hyperlink"/>
@@ -4171,7 +4311,7 @@
                 <w:noProof/>
                 <w:webHidden/>
               </w:rPr>
-              <w:instrText xml:space="preserve"> PAGEREF _Toc353986070 \h </w:instrText>
+              <w:instrText xml:space="preserve"> PAGEREF _Toc396470065 \h </w:instrText>
             </w:r>
             <w:r>
               <w:rPr>
@@ -4191,7 +4331,7 @@
                 <w:noProof/>
                 <w:webHidden/>
               </w:rPr>
-              <w:t>62</w:t>
+              <w:t>71</w:t>
             </w:r>
             <w:r>
               <w:rPr>
@@ -4214,7 +4354,7 @@
               <w:szCs w:val="22"/>
             </w:rPr>
           </w:pPr>
-          <w:hyperlink w:anchor="_Toc353986071" w:history="1">
+          <w:hyperlink w:anchor="_Toc396470066" w:history="1">
             <w:r>
               <w:rPr>
                 <w:rStyle w:val="Hyperlink"/>
@@ -4241,7 +4381,7 @@
                 <w:noProof/>
                 <w:webHidden/>
               </w:rPr>
-              <w:instrText xml:space="preserve"> PAGEREF _Toc353986071 \h </w:instrText>
+              <w:instrText xml:space="preserve"> PAGEREF _Toc396470066 \h </w:instrText>
             </w:r>
             <w:r>
               <w:rPr>
@@ -4261,7 +4401,7 @@
                 <w:noProof/>
                 <w:webHidden/>
               </w:rPr>
-              <w:t>65</w:t>
+              <w:t>74</w:t>
             </w:r>
             <w:r>
               <w:rPr>
@@ -4284,7 +4424,7 @@
               <w:szCs w:val="22"/>
             </w:rPr>
           </w:pPr>
-          <w:hyperlink w:anchor="_Toc353986072" w:history="1">
+          <w:hyperlink w:anchor="_Toc396470067" w:history="1">
             <w:r>
               <w:rPr>
                 <w:rStyle w:val="Hyperlink"/>
@@ -4311,7 +4451,7 @@
                 <w:noProof/>
                 <w:webHidden/>
               </w:rPr>
-              <w:instrText xml:space="preserve"> PAGEREF _Toc353986072 \h </w:instrText>
+              <w:instrText xml:space="preserve"> PAGEREF _Toc396470067 \h </w:instrText>
             </w:r>
             <w:r>
               <w:rPr>
@@ -4331,7 +4471,7 @@
                 <w:noProof/>
                 <w:webHidden/>
               </w:rPr>
-              <w:t>68</w:t>
+              <w:t>77</w:t>
             </w:r>
             <w:r>
               <w:rPr>
@@ -4354,7 +4494,7 @@
               <w:szCs w:val="22"/>
             </w:rPr>
           </w:pPr>
-          <w:hyperlink w:anchor="_Toc353986073" w:history="1">
+          <w:hyperlink w:anchor="_Toc396470068" w:history="1">
             <w:r>
               <w:rPr>
                 <w:rStyle w:val="Hyperlink"/>
@@ -4381,7 +4521,7 @@
                 <w:noProof/>
                 <w:webHidden/>
               </w:rPr>
-              <w:instrText xml:space="preserve"> PAGEREF _Toc353986073 \h </w:instrText>
+              <w:instrText xml:space="preserve"> PAGEREF _Toc396470068 \h </w:instrText>
             </w:r>
             <w:r>
               <w:rPr>
@@ -4401,7 +4541,7 @@
                 <w:noProof/>
                 <w:webHidden/>
               </w:rPr>
-              <w:t>73</w:t>
+              <w:t>82</w:t>
             </w:r>
             <w:r>
               <w:rPr>
@@ -4424,7 +4564,7 @@
               <w:szCs w:val="22"/>
             </w:rPr>
           </w:pPr>
-          <w:hyperlink w:anchor="_Toc353986074" w:history="1">
+          <w:hyperlink w:anchor="_Toc396470069" w:history="1">
             <w:r>
               <w:rPr>
                 <w:rStyle w:val="Hyperlink"/>
@@ -4451,7 +4591,7 @@
                 <w:noProof/>
                 <w:webHidden/>
               </w:rPr>
-              <w:instrText xml:space="preserve"> PAGEREF _Toc353986074 \h </w:instrText>
+              <w:instrText xml:space="preserve"> PAGEREF _Toc396470069 \h </w:instrText>
             </w:r>
             <w:r>
               <w:rPr>
@@ -4471,7 +4611,7 @@
                 <w:noProof/>
                 <w:webHidden/>
               </w:rPr>
-              <w:t>73</w:t>
+              <w:t>82</w:t>
             </w:r>
             <w:r>
               <w:rPr>
@@ -4494,7 +4634,7 @@
               <w:szCs w:val="22"/>
             </w:rPr>
           </w:pPr>
-          <w:hyperlink w:anchor="_Toc353986075" w:history="1">
+          <w:hyperlink w:anchor="_Toc396470070" w:history="1">
             <w:r>
               <w:rPr>
                 <w:rStyle w:val="Hyperlink"/>
@@ -4521,7 +4661,7 @@
                 <w:noProof/>
                 <w:webHidden/>
               </w:rPr>
-              <w:instrText xml:space="preserve"> PAGEREF _Toc353986075 \h </w:instrText>
+              <w:instrText xml:space="preserve"> PAGEREF _Toc396470070 \h </w:instrText>
             </w:r>
             <w:r>
               <w:rPr>
@@ -4541,7 +4681,7 @@
                 <w:noProof/>
                 <w:webHidden/>
               </w:rPr>
-              <w:t>73</w:t>
+              <w:t>82</w:t>
             </w:r>
             <w:r>
               <w:rPr>
@@ -4564,7 +4704,7 @@
               <w:szCs w:val="22"/>
             </w:rPr>
           </w:pPr>
-          <w:hyperlink w:anchor="_Toc353986076" w:history="1">
+          <w:hyperlink w:anchor="_Toc396470071" w:history="1">
             <w:r>
               <w:rPr>
                 <w:rStyle w:val="Hyperlink"/>
@@ -4591,7 +4731,7 @@
                 <w:noProof/>
                 <w:webHidden/>
               </w:rPr>
-              <w:instrText xml:space="preserve"> PAGEREF _Toc353986076 \h </w:instrText>
+              <w:instrText xml:space="preserve"> PAGEREF _Toc396470071 \h </w:instrText>
             </w:r>
             <w:r>
               <w:rPr>
@@ -4611,7 +4751,7 @@
                 <w:noProof/>
                 <w:webHidden/>
               </w:rPr>
-              <w:t>75</w:t>
+              <w:t>84</w:t>
             </w:r>
             <w:r>
               <w:rPr>
@@ -4634,7 +4774,7 @@
               <w:szCs w:val="22"/>
             </w:rPr>
           </w:pPr>
-          <w:hyperlink w:anchor="_Toc353986077" w:history="1">
+          <w:hyperlink w:anchor="_Toc396470072" w:history="1">
             <w:r>
               <w:rPr>
                 <w:rStyle w:val="Hyperlink"/>
@@ -4661,7 +4801,7 @@
                 <w:noProof/>
                 <w:webHidden/>
               </w:rPr>
-              <w:instrText xml:space="preserve"> PAGEREF _Toc353986077 \h </w:instrText>
+              <w:instrText xml:space="preserve"> PAGEREF _Toc396470072 \h </w:instrText>
             </w:r>
             <w:r>
               <w:rPr>
@@ -4681,7 +4821,7 @@
                 <w:noProof/>
                 <w:webHidden/>
               </w:rPr>
-              <w:t>78</w:t>
+              <w:t>87</w:t>
             </w:r>
             <w:r>
               <w:rPr>
@@ -4704,7 +4844,7 @@
               <w:szCs w:val="22"/>
             </w:rPr>
           </w:pPr>
-          <w:hyperlink w:anchor="_Toc353986078" w:history="1">
+          <w:hyperlink w:anchor="_Toc396470073" w:history="1">
             <w:r>
               <w:rPr>
                 <w:rStyle w:val="Hyperlink"/>
@@ -4731,7 +4871,7 @@
                 <w:noProof/>
                 <w:webHidden/>
               </w:rPr>
-              <w:instrText xml:space="preserve"> PAGEREF _Toc353986078 \h </w:instrText>
+              <w:instrText xml:space="preserve"> PAGEREF _Toc396470073 \h </w:instrText>
             </w:r>
             <w:r>
               <w:rPr>
@@ -4751,7 +4891,7 @@
                 <w:noProof/>
                 <w:webHidden/>
               </w:rPr>
-              <w:t>78</w:t>
+              <w:t>87</w:t>
             </w:r>
             <w:r>
               <w:rPr>
@@ -4774,7 +4914,7 @@
               <w:szCs w:val="22"/>
             </w:rPr>
           </w:pPr>
-          <w:hyperlink w:anchor="_Toc353986079" w:history="1">
+          <w:hyperlink w:anchor="_Toc396470074" w:history="1">
             <w:r>
               <w:rPr>
                 <w:rStyle w:val="Hyperlink"/>
@@ -4801,7 +4941,7 @@
                 <w:noProof/>
                 <w:webHidden/>
               </w:rPr>
-              <w:instrText xml:space="preserve"> PAGEREF _Toc353986079 \h </w:instrText>
+              <w:instrText xml:space="preserve"> PAGEREF _Toc396470074 \h </w:instrText>
             </w:r>
             <w:r>
               <w:rPr>
@@ -4821,7 +4961,7 @@
                 <w:noProof/>
                 <w:webHidden/>
               </w:rPr>
-              <w:t>79</w:t>
+              <w:t>88</w:t>
             </w:r>
             <w:r>
               <w:rPr>
@@ -4844,7 +4984,7 @@
               <w:szCs w:val="22"/>
             </w:rPr>
           </w:pPr>
-          <w:hyperlink w:anchor="_Toc353986080" w:history="1">
+          <w:hyperlink w:anchor="_Toc396470075" w:history="1">
             <w:r>
               <w:rPr>
                 <w:rStyle w:val="Hyperlink"/>
@@ -4871,7 +5011,7 @@
                 <w:noProof/>
                 <w:webHidden/>
               </w:rPr>
-              <w:instrText xml:space="preserve"> PAGEREF _Toc353986080 \h </w:instrText>
+              <w:instrText xml:space="preserve"> PAGEREF _Toc396470075 \h </w:instrText>
             </w:r>
             <w:r>
               <w:rPr>
@@ -4891,7 +5031,7 @@
                 <w:noProof/>
                 <w:webHidden/>
               </w:rPr>
-              <w:t>80</w:t>
+              <w:t>89</w:t>
             </w:r>
             <w:r>
               <w:rPr>
@@ -4914,7 +5054,7 @@
               <w:szCs w:val="22"/>
             </w:rPr>
           </w:pPr>
-          <w:hyperlink w:anchor="_Toc353986081" w:history="1">
+          <w:hyperlink w:anchor="_Toc396470076" w:history="1">
             <w:r>
               <w:rPr>
                 <w:rStyle w:val="Hyperlink"/>
@@ -4941,7 +5081,7 @@
                 <w:noProof/>
                 <w:webHidden/>
               </w:rPr>
-              <w:instrText xml:space="preserve"> PAGEREF _Toc353986081 \h </w:instrText>
+              <w:instrText xml:space="preserve"> PAGEREF _Toc396470076 \h </w:instrText>
             </w:r>
             <w:r>
               <w:rPr>
@@ -4961,7 +5101,7 @@
                 <w:noProof/>
                 <w:webHidden/>
               </w:rPr>
-              <w:t>82</w:t>
+              <w:t>91</w:t>
             </w:r>
             <w:r>
               <w:rPr>
@@ -4984,7 +5124,7 @@
               <w:szCs w:val="22"/>
             </w:rPr>
           </w:pPr>
-          <w:hyperlink w:anchor="_Toc353986082" w:history="1">
+          <w:hyperlink w:anchor="_Toc396470077" w:history="1">
             <w:r>
               <w:rPr>
                 <w:rStyle w:val="Hyperlink"/>
@@ -5011,7 +5151,7 @@
                 <w:noProof/>
                 <w:webHidden/>
               </w:rPr>
-              <w:instrText xml:space="preserve"> PAGEREF _Toc353986082 \h </w:instrText>
+              <w:instrText xml:space="preserve"> PAGEREF _Toc396470077 \h </w:instrText>
             </w:r>
             <w:r>
               <w:rPr>
@@ -5031,7 +5171,7 @@
                 <w:noProof/>
                 <w:webHidden/>
               </w:rPr>
-              <w:t>82</w:t>
+              <w:t>91</w:t>
             </w:r>
             <w:r>
               <w:rPr>
@@ -5054,7 +5194,7 @@
               <w:szCs w:val="22"/>
             </w:rPr>
           </w:pPr>
-          <w:hyperlink w:anchor="_Toc353986083" w:history="1">
+          <w:hyperlink w:anchor="_Toc396470078" w:history="1">
             <w:r>
               <w:rPr>
                 <w:rStyle w:val="Hyperlink"/>
@@ -5081,7 +5221,7 @@
                 <w:noProof/>
                 <w:webHidden/>
               </w:rPr>
-              <w:instrText xml:space="preserve"> PAGEREF _Toc353986083 \h </w:instrText>
+              <w:instrText xml:space="preserve"> PAGEREF _Toc396470078 \h </w:instrText>
             </w:r>
             <w:r>
               <w:rPr>
@@ -5101,7 +5241,7 @@
                 <w:noProof/>
                 <w:webHidden/>
               </w:rPr>
-              <w:t>84</w:t>
+              <w:t>93</w:t>
             </w:r>
             <w:r>
               <w:rPr>
@@ -5124,7 +5264,7 @@
               <w:szCs w:val="22"/>
             </w:rPr>
           </w:pPr>
-          <w:hyperlink w:anchor="_Toc353986084" w:history="1">
+          <w:hyperlink w:anchor="_Toc396470079" w:history="1">
             <w:r>
               <w:rPr>
                 <w:rStyle w:val="Hyperlink"/>
@@ -5151,7 +5291,7 @@
                 <w:noProof/>
                 <w:webHidden/>
               </w:rPr>
-              <w:instrText xml:space="preserve"> PAGEREF _Toc353986084 \h </w:instrText>
+              <w:instrText xml:space="preserve"> PAGEREF _Toc396470079 \h </w:instrText>
             </w:r>
             <w:r>
               <w:rPr>
@@ -5171,7 +5311,7 @@
                 <w:noProof/>
                 <w:webHidden/>
               </w:rPr>
-              <w:t>85</w:t>
+              <w:t>94</w:t>
             </w:r>
             <w:r>
               <w:rPr>
@@ -5194,7 +5334,7 @@
               <w:szCs w:val="22"/>
             </w:rPr>
           </w:pPr>
-          <w:hyperlink w:anchor="_Toc353986085" w:history="1">
+          <w:hyperlink w:anchor="_Toc396470080" w:history="1">
             <w:r>
               <w:rPr>
                 <w:rStyle w:val="Hyperlink"/>
@@ -5221,7 +5361,7 @@
                 <w:noProof/>
                 <w:webHidden/>
               </w:rPr>
-              <w:instrText xml:space="preserve"> PAGEREF _Toc353986085 \h </w:instrText>
+              <w:instrText xml:space="preserve"> PAGEREF _Toc396470080 \h </w:instrText>
             </w:r>
             <w:r>
               <w:rPr>
@@ -5241,7 +5381,7 @@
                 <w:noProof/>
                 <w:webHidden/>
               </w:rPr>
-              <w:t>85</w:t>
+              <w:t>94</w:t>
             </w:r>
             <w:r>
               <w:rPr>
@@ -5264,7 +5404,7 @@
               <w:szCs w:val="22"/>
             </w:rPr>
           </w:pPr>
-          <w:hyperlink w:anchor="_Toc353986086" w:history="1">
+          <w:hyperlink w:anchor="_Toc396470081" w:history="1">
             <w:r>
               <w:rPr>
                 <w:rStyle w:val="Hyperlink"/>
@@ -5291,7 +5431,7 @@
                 <w:noProof/>
                 <w:webHidden/>
               </w:rPr>
-              <w:instrText xml:space="preserve"> PAGEREF _Toc353986086 \h </w:instrText>
+              <w:instrText xml:space="preserve"> PAGEREF _Toc396470081 \h </w:instrText>
             </w:r>
             <w:r>
               <w:rPr>
@@ -5311,7 +5451,7 @@
                 <w:noProof/>
                 <w:webHidden/>
               </w:rPr>
-              <w:t>85</w:t>
+              <w:t>94</w:t>
             </w:r>
             <w:r>
               <w:rPr>
@@ -5334,7 +5474,7 @@
               <w:szCs w:val="22"/>
             </w:rPr>
           </w:pPr>
-          <w:hyperlink w:anchor="_Toc353986087" w:history="1">
+          <w:hyperlink w:anchor="_Toc396470082" w:history="1">
             <w:r>
               <w:rPr>
                 <w:rStyle w:val="Hyperlink"/>
@@ -5361,7 +5501,7 @@
                 <w:noProof/>
                 <w:webHidden/>
               </w:rPr>
-              <w:instrText xml:space="preserve"> PAGEREF _Toc353986087 \h </w:instrText>
+              <w:instrText xml:space="preserve"> PAGEREF _Toc396470082 \h </w:instrText>
             </w:r>
             <w:r>
               <w:rPr>
@@ -5381,7 +5521,7 @@
                 <w:noProof/>
                 <w:webHidden/>
               </w:rPr>
-              <w:t>85</w:t>
+              <w:t>94</w:t>
             </w:r>
             <w:r>
               <w:rPr>
@@ -5404,7 +5544,7 @@
               <w:szCs w:val="22"/>
             </w:rPr>
           </w:pPr>
-          <w:hyperlink w:anchor="_Toc353986088" w:history="1">
+          <w:hyperlink w:anchor="_Toc396470083" w:history="1">
             <w:r>
               <w:rPr>
                 <w:rStyle w:val="Hyperlink"/>
@@ -5431,7 +5571,7 @@
                 <w:noProof/>
                 <w:webHidden/>
               </w:rPr>
-              <w:instrText xml:space="preserve"> PAGEREF _Toc353986088 \h </w:instrText>
+              <w:instrText xml:space="preserve"> PAGEREF _Toc396470083 \h </w:instrText>
             </w:r>
             <w:r>
               <w:rPr>
@@ -5451,7 +5591,7 @@
                 <w:noProof/>
                 <w:webHidden/>
               </w:rPr>
-              <w:t>90</w:t>
+              <w:t>99</w:t>
             </w:r>
             <w:r>
               <w:rPr>
@@ -5474,7 +5614,7 @@
               <w:szCs w:val="22"/>
             </w:rPr>
           </w:pPr>
-          <w:hyperlink w:anchor="_Toc353986089" w:history="1">
+          <w:hyperlink w:anchor="_Toc396470084" w:history="1">
             <w:r>
               <w:rPr>
                 <w:rStyle w:val="Hyperlink"/>
@@ -5501,7 +5641,7 @@
                 <w:noProof/>
                 <w:webHidden/>
               </w:rPr>
-              <w:instrText xml:space="preserve"> PAGEREF _Toc353986089 \h </w:instrText>
+              <w:instrText xml:space="preserve"> PAGEREF _Toc396470084 \h </w:instrText>
             </w:r>
             <w:r>
               <w:rPr>
@@ -5521,7 +5661,7 @@
                 <w:noProof/>
                 <w:webHidden/>
               </w:rPr>
-              <w:t>90</w:t>
+              <w:t>99</w:t>
             </w:r>
             <w:r>
               <w:rPr>
@@ -5544,7 +5684,7 @@
               <w:szCs w:val="22"/>
             </w:rPr>
           </w:pPr>
-          <w:hyperlink w:anchor="_Toc353986090" w:history="1">
+          <w:hyperlink w:anchor="_Toc396470085" w:history="1">
             <w:r>
               <w:rPr>
                 <w:rStyle w:val="Hyperlink"/>
@@ -5571,7 +5711,7 @@
                 <w:noProof/>
                 <w:webHidden/>
               </w:rPr>
-              <w:instrText xml:space="preserve"> PAGEREF _Toc353986090 \h </w:instrText>
+              <w:instrText xml:space="preserve"> PAGEREF _Toc396470085 \h </w:instrText>
             </w:r>
             <w:r>
               <w:rPr>
@@ -5591,7 +5731,7 @@
                 <w:noProof/>
                 <w:webHidden/>
               </w:rPr>
-              <w:t>90</w:t>
+              <w:t>99</w:t>
             </w:r>
             <w:r>
               <w:rPr>
@@ -5614,7 +5754,7 @@
               <w:szCs w:val="22"/>
             </w:rPr>
           </w:pPr>
-          <w:hyperlink w:anchor="_Toc353986091" w:history="1">
+          <w:hyperlink w:anchor="_Toc396470086" w:history="1">
             <w:r>
               <w:rPr>
                 <w:rStyle w:val="Hyperlink"/>
@@ -5641,7 +5781,7 @@
                 <w:noProof/>
                 <w:webHidden/>
               </w:rPr>
-              <w:instrText xml:space="preserve"> PAGEREF _Toc353986091 \h </w:instrText>
+              <w:instrText xml:space="preserve"> PAGEREF _Toc396470086 \h </w:instrText>
             </w:r>
             <w:r>
               <w:rPr>
@@ -5661,7 +5801,7 @@
                 <w:noProof/>
                 <w:webHidden/>
               </w:rPr>
-              <w:t>90</w:t>
+              <w:t>99</w:t>
             </w:r>
             <w:r>
               <w:rPr>
@@ -5684,7 +5824,7 @@
               <w:szCs w:val="22"/>
             </w:rPr>
           </w:pPr>
-          <w:hyperlink w:anchor="_Toc353986092" w:history="1">
+          <w:hyperlink w:anchor="_Toc396470087" w:history="1">
             <w:r>
               <w:rPr>
                 <w:rStyle w:val="Hyperlink"/>
@@ -5711,7 +5851,7 @@
                 <w:noProof/>
                 <w:webHidden/>
               </w:rPr>
-              <w:instrText xml:space="preserve"> PAGEREF _Toc353986092 \h </w:instrText>
+              <w:instrText xml:space="preserve"> PAGEREF _Toc396470087 \h </w:instrText>
             </w:r>
             <w:r>
               <w:rPr>
@@ -5731,7 +5871,7 @@
                 <w:noProof/>
                 <w:webHidden/>
               </w:rPr>
-              <w:t>93</w:t>
+              <w:t>102</w:t>
             </w:r>
             <w:r>
               <w:rPr>
@@ -5754,7 +5894,7 @@
               <w:szCs w:val="22"/>
             </w:rPr>
           </w:pPr>
-          <w:hyperlink w:anchor="_Toc353986093" w:history="1">
+          <w:hyperlink w:anchor="_Toc396470088" w:history="1">
             <w:r>
               <w:rPr>
                 <w:rStyle w:val="Hyperlink"/>
@@ -5781,7 +5921,7 @@
                 <w:noProof/>
                 <w:webHidden/>
               </w:rPr>
-              <w:instrText xml:space="preserve"> PAGEREF _Toc353986093 \h </w:instrText>
+              <w:instrText xml:space="preserve"> PAGEREF _Toc396470088 \h </w:instrText>
             </w:r>
             <w:r>
               <w:rPr>
@@ -5801,7 +5941,7 @@
                 <w:noProof/>
                 <w:webHidden/>
               </w:rPr>
-              <w:t>94</w:t>
+              <w:t>103</w:t>
             </w:r>
             <w:r>
               <w:rPr>
@@ -5824,7 +5964,7 @@
               <w:szCs w:val="22"/>
             </w:rPr>
           </w:pPr>
-          <w:hyperlink w:anchor="_Toc353986094" w:history="1">
+          <w:hyperlink w:anchor="_Toc396470089" w:history="1">
             <w:r>
               <w:rPr>
                 <w:rStyle w:val="Hyperlink"/>
@@ -5851,7 +5991,7 @@
                 <w:noProof/>
                 <w:webHidden/>
               </w:rPr>
-              <w:instrText xml:space="preserve"> PAGEREF _Toc353986094 \h </w:instrText>
+              <w:instrText xml:space="preserve"> PAGEREF _Toc396470089 \h </w:instrText>
             </w:r>
             <w:r>
               <w:rPr>
@@ -5871,7 +6011,7 @@
                 <w:noProof/>
                 <w:webHidden/>
               </w:rPr>
-              <w:t>95</w:t>
+              <w:t>104</w:t>
             </w:r>
             <w:r>
               <w:rPr>
@@ -5894,7 +6034,7 @@
               <w:szCs w:val="22"/>
             </w:rPr>
           </w:pPr>
-          <w:hyperlink w:anchor="_Toc353986095" w:history="1">
+          <w:hyperlink w:anchor="_Toc396470090" w:history="1">
             <w:r>
               <w:rPr>
                 <w:rStyle w:val="Hyperlink"/>
@@ -5921,7 +6061,7 @@
                 <w:noProof/>
                 <w:webHidden/>
               </w:rPr>
-              <w:instrText xml:space="preserve"> PAGEREF _Toc353986095 \h </w:instrText>
+              <w:instrText xml:space="preserve"> PAGEREF _Toc396470090 \h </w:instrText>
             </w:r>
             <w:r>
               <w:rPr>
@@ -5941,7 +6081,7 @@
                 <w:noProof/>
                 <w:webHidden/>
               </w:rPr>
-              <w:t>95</w:t>
+              <w:t>104</w:t>
             </w:r>
             <w:r>
               <w:rPr>
@@ -5964,7 +6104,7 @@
               <w:szCs w:val="22"/>
             </w:rPr>
           </w:pPr>
-          <w:hyperlink w:anchor="_Toc353986096" w:history="1">
+          <w:hyperlink w:anchor="_Toc396470091" w:history="1">
             <w:r>
               <w:rPr>
                 <w:rStyle w:val="Hyperlink"/>
@@ -5991,7 +6131,7 @@
                 <w:noProof/>
                 <w:webHidden/>
               </w:rPr>
-              <w:instrText xml:space="preserve"> PAGEREF _Toc353986096 \h </w:instrText>
+              <w:instrText xml:space="preserve"> PAGEREF _Toc396470091 \h </w:instrText>
             </w:r>
             <w:r>
               <w:rPr>
@@ -6011,7 +6151,7 @@
                 <w:noProof/>
                 <w:webHidden/>
               </w:rPr>
-              <w:t>96</w:t>
+              <w:t>105</w:t>
             </w:r>
             <w:r>
               <w:rPr>
@@ -6034,7 +6174,7 @@
               <w:szCs w:val="22"/>
             </w:rPr>
           </w:pPr>
-          <w:hyperlink w:anchor="_Toc353986097" w:history="1">
+          <w:hyperlink w:anchor="_Toc396470092" w:history="1">
             <w:r>
               <w:rPr>
                 <w:rStyle w:val="Hyperlink"/>
@@ -6061,7 +6201,7 @@
                 <w:noProof/>
                 <w:webHidden/>
               </w:rPr>
-              <w:instrText xml:space="preserve"> PAGEREF _Toc353986097 \h </w:instrText>
+              <w:instrText xml:space="preserve"> PAGEREF _Toc396470092 \h </w:instrText>
             </w:r>
             <w:r>
               <w:rPr>
@@ -6081,7 +6221,7 @@
                 <w:noProof/>
                 <w:webHidden/>
               </w:rPr>
-              <w:t>100</w:t>
+              <w:t>109</w:t>
             </w:r>
             <w:r>
               <w:rPr>
@@ -13951,6 +14091,54 @@
       <w:szCs w:val="22"/>
     </w:rPr>
   </w:style>
+  <w:style w:type="paragraph" w:customStyle="1" w:styleId="CodeBlock18">
+    <w:name w:val="Code Block18"/>
+    <w:basedOn w:val="Normal"/>
+    <w:uiPriority w:val="99"/>
+    <w:qFormat/>
+    <w:rsid w:val="002D5207"/>
+    <w:pPr>
+      <w:keepNext/>
+      <w:keepLines/>
+      <w:widowControl w:val="0"/>
+      <w:pBdr>
+        <w:top w:val="single" w:sz="8" w:space="1" w:color="4F81BD" w:themeColor="accent1"/>
+        <w:left w:val="single" w:sz="24" w:space="4" w:color="4F81BD" w:themeColor="accent1"/>
+      </w:pBdr>
+      <w:shd w:val="clear" w:color="auto" w:fill="EEECE1" w:themeFill="background2"/>
+      <w:spacing w:before="0" w:after="0"/>
+      <w:ind w:left="288" w:right="288"/>
+    </w:pPr>
+    <w:rPr>
+      <w:rFonts w:ascii="Courier New" w:hAnsi="Courier New"/>
+      <w:i/>
+      <w:szCs w:val="22"/>
+    </w:rPr>
+  </w:style>
+  <w:style w:type="paragraph" w:customStyle="1" w:styleId="FunctionDeclarationHeader15">
+    <w:name w:val="Function Declaration Header15"/>
+    <w:basedOn w:val="Heading4"/>
+    <w:qFormat/>
+    <w:rsid w:val="002D5207"/>
+    <w:pPr>
+      <w:keepNext/>
+      <w:keepLines/>
+      <w:pBdr>
+        <w:top w:val="none" w:sz="0" w:space="0" w:color="auto"/>
+        <w:left w:val="none" w:sz="0" w:space="0" w:color="auto"/>
+      </w:pBdr>
+      <w:shd w:val="clear" w:color="DBE5F1" w:themeColor="accent1" w:themeTint="33" w:fill="auto"/>
+      <w:spacing w:before="200"/>
+    </w:pPr>
+    <w:rPr>
+      <w:rFonts w:asciiTheme="majorHAnsi" w:eastAsiaTheme="majorEastAsia" w:hAnsiTheme="majorHAnsi" w:cstheme="majorBidi"/>
+      <w:b/>
+      <w:bCs/>
+      <w:iCs/>
+      <w:color w:val="4F81BD" w:themeColor="accent1"/>
+      <w:spacing w:val="0"/>
+    </w:rPr>
+  </w:style>
 </w:styles>
 </file>
 
@@ -15951,6 +16139,54 @@
       <w:rFonts w:ascii="Courier New" w:hAnsi="Courier New"/>
       <w:i/>
       <w:szCs w:val="22"/>
+    </w:rPr>
+  </w:style>
+  <w:style w:type="paragraph" w:customStyle="1" w:styleId="CodeBlock18">
+    <w:name w:val="Code Block18"/>
+    <w:basedOn w:val="Normal"/>
+    <w:uiPriority w:val="99"/>
+    <w:qFormat/>
+    <w:rsid w:val="002D5207"/>
+    <w:pPr>
+      <w:keepNext/>
+      <w:keepLines/>
+      <w:widowControl w:val="0"/>
+      <w:pBdr>
+        <w:top w:val="single" w:sz="8" w:space="1" w:color="4F81BD" w:themeColor="accent1"/>
+        <w:left w:val="single" w:sz="24" w:space="4" w:color="4F81BD" w:themeColor="accent1"/>
+      </w:pBdr>
+      <w:shd w:val="clear" w:color="auto" w:fill="EEECE1" w:themeFill="background2"/>
+      <w:spacing w:before="0" w:after="0"/>
+      <w:ind w:left="288" w:right="288"/>
+    </w:pPr>
+    <w:rPr>
+      <w:rFonts w:ascii="Courier New" w:hAnsi="Courier New"/>
+      <w:i/>
+      <w:szCs w:val="22"/>
+    </w:rPr>
+  </w:style>
+  <w:style w:type="paragraph" w:customStyle="1" w:styleId="FunctionDeclarationHeader15">
+    <w:name w:val="Function Declaration Header15"/>
+    <w:basedOn w:val="Heading4"/>
+    <w:qFormat/>
+    <w:rsid w:val="002D5207"/>
+    <w:pPr>
+      <w:keepNext/>
+      <w:keepLines/>
+      <w:pBdr>
+        <w:top w:val="none" w:sz="0" w:space="0" w:color="auto"/>
+        <w:left w:val="none" w:sz="0" w:space="0" w:color="auto"/>
+      </w:pBdr>
+      <w:shd w:val="clear" w:color="DBE5F1" w:themeColor="accent1" w:themeTint="33" w:fill="auto"/>
+      <w:spacing w:before="200"/>
+    </w:pPr>
+    <w:rPr>
+      <w:rFonts w:asciiTheme="majorHAnsi" w:eastAsiaTheme="majorEastAsia" w:hAnsiTheme="majorHAnsi" w:cstheme="majorBidi"/>
+      <w:b/>
+      <w:bCs/>
+      <w:iCs/>
+      <w:color w:val="4F81BD" w:themeColor="accent1"/>
+      <w:spacing w:val="0"/>
     </w:rPr>
   </w:style>
 </w:styles>
@@ -16246,7 +16482,7 @@
 </file>
 
 <file path=customXml/itemProps1.xml><?xml version="1.0" encoding="utf-8"?>
-<ds:datastoreItem xmlns:ds="http://schemas.openxmlformats.org/officeDocument/2006/customXml" ds:itemID="{ADFFC128-9577-4DE1-8440-A87597E3E9E1}">
+<ds:datastoreItem xmlns:ds="http://schemas.openxmlformats.org/officeDocument/2006/customXml" ds:itemID="{A3091ABC-5900-48BF-85CC-B2EDE215E9CF}">
   <ds:schemaRefs>
     <ds:schemaRef ds:uri="http://schemas.openxmlformats.org/officeDocument/2006/bibliography"/>
   </ds:schemaRefs>

</xml_diff>